<commit_message>
feat(db): optimize 3nf schema and eliminate column stuffing across mf01-mf04
</commit_message>
<xml_diff>
--- a/docs/07_reports_and_plans/Review 2/SWP490_R2_BM01_Design_Brief_1.docx
+++ b/docs/07_reports_and_plans/Review 2/SWP490_R2_BM01_Design_Brief_1.docx
@@ -328,7 +328,7 @@
                 <w:i w:val="false"/>
                 <w:iCs w:val="false"/>
               </w:rPr>
-              <w:t xml:space="preserve">ThS. Nguyễn Thị Cẩm Hương</w:t>
+              <w:t xml:space="preserve">TS. Nguyễn Thị Cẩm Hương</w:t>
             </w:r>
           </w:p>
         </w:tc>
@@ -1157,7 +1157,7 @@
                 <w:i w:val="false"/>
                 <w:iCs w:val="false"/>
               </w:rPr>
-              <w:t xml:space="preserve">Giảng viên gọi hỏi và nhập điểm trực tiếp trong buổi thi.</w:t>
+              <w:t xml:space="preserve">Giảng viên hậu kiểm, và nhập điểm so sánh giữa điểm AI và file nghe.</w:t>
             </w:r>
           </w:p>
         </w:tc>
@@ -1219,7 +1219,7 @@
                 <w:i w:val="false"/>
                 <w:iCs w:val="false"/>
               </w:rPr>
-              <w:t xml:space="preserve">Giảm tải thời gian hỏi thi trực tiếp cho giảng viên mà vẫn giữ quyền xác minh và quyết định điểm số chính thức thuộc về con người.</w:t>
+              <w:t xml:space="preserve">Giảm tải thời gian chấm điểm cho giảng viên mà vẫn giữ quyền xác minh và quyết định điểm số chính thức thuộc về con người.</w:t>
             </w:r>
           </w:p>
         </w:tc>
@@ -2102,7 +2102,7 @@
                 <w:i w:val="false"/>
                 <w:iCs w:val="false"/>
               </w:rPr>
-              <w:t xml:space="preserve">Độ tin cậy khi tích hợp dịch vụ AI và giọng nói</w:t>
+              <w:t xml:space="preserve">Vai trò hỗ trợ của AI và quyền quyết định của con người</w:t>
             </w:r>
           </w:p>
         </w:tc>
@@ -2133,7 +2133,7 @@
                 <w:i w:val="false"/>
                 <w:iCs w:val="false"/>
               </w:rPr>
-              <w:t xml:space="preserve">Phụ thuộc một lần gọi dịch vụ duy nhất; tự động thử lại kết hợp lưu hàng đợi lỗi để chấm bù</w:t>
+              <w:t xml:space="preserve">Để AI tự động phát hành câu hỏi và tự quyết định điểm số; dùng AI làm công cụ gợi ý có giải thích dưới sự kiểm soát của giảng viên</w:t>
             </w:r>
           </w:p>
         </w:tc>
@@ -2164,7 +2164,7 @@
                 <w:i w:val="false"/>
                 <w:iCs w:val="false"/>
               </w:rPr>
-              <w:t xml:space="preserve">Chọn cơ chế tự động thử lại (tối đa 3 lần) và lưu các tác vụ lỗi vào hàng đợi chờ chấm bù (tự động sau 5 phút hoặc do Trưởng bộ môn kích hoạt chạy lại) nhằm tránh mất bài nộp.</w:t>
+              <w:t xml:space="preserve">AI chỉ hỗ trợ sinh câu hỏi nháp theo CLO và chấm điểm sơ bộ kèm lập luận theo Rubric; nội dung AI sinh ra luôn cho phép chỉnh sửa và không bao giờ tự động duyệt câu hỏi hay tự chốt điểm thi chính thức.</w:t>
             </w:r>
           </w:p>
         </w:tc>
@@ -2226,7 +2226,7 @@
                 <w:i w:val="false"/>
                 <w:iCs w:val="false"/>
               </w:rPr>
-              <w:t xml:space="preserve">Luồng Chấm điểm &amp; Khôi phục lỗi; Sơ đồ Kiến trúc</w:t>
+              <w:t xml:space="preserve">Sinh câu hỏi AI &amp; Chấm điểm theo Rubric</w:t>
             </w:r>
           </w:p>
         </w:tc>
@@ -5830,7 +5830,7 @@
                 <w:i w:val="false"/>
                 <w:iCs w:val="false"/>
               </w:rPr>
-              <w:t xml:space="preserve">Done</w:t>
+              <w:t xml:space="preserve">In progress</w:t>
             </w:r>
           </w:p>
         </w:tc>
@@ -6018,7 +6018,7 @@
                 <w:i w:val="false"/>
                 <w:iCs w:val="false"/>
               </w:rPr>
-              <w:t xml:space="preserve">Done</w:t>
+              <w:t xml:space="preserve">In progress</w:t>
             </w:r>
           </w:p>
         </w:tc>

</xml_diff>